<commit_message>
Revisión completa: prueba contra PostgreSQL real, registro de errores y documentación
- tests/integracion.pg.mjs: el servidor real contra un PostgreSQL real (telar,
  dibujos, conductor, eventos de los ESP32, sensor, invitaciones simultáneas).
- errorHandler: los rechazos esperados de la base (400/409) ya no se registran
  como errores del servidor.
- Manual de la web (Word) y manual de instalación: Pausa, Iniciar, Retroceder,
  Terminar trabajo, posición incierta y repeticiones por fila, según cómo
  funcionan hoy.
- README, PUESTA_EN_MARCHA, READMEs del backend y del firmware: WiFi y clave de
  ejemplo en los config, API (cliente, OTRO_CONDUCTOR, tope de pasos,
  segundos_desde_ping), estructura de carpetas y pruebas.
- CAMBIOS_REVISION: sección de esta revisión.

Co-Authored-By: Claude Opus 5.5 <noreply@anthropic.com>
Claude-Session: https://claude.ai/code/session_01QiY8ZZNAM9gwPKiqSkCaaj
</commit_message>
<xml_diff>
--- a/documentacion_proyecto/Manual_Pagina_Web_Telar.docx
+++ b/documentacion_proyecto/Manual_Pagina_Web_Telar.docx
@@ -2612,21 +2612,21 @@
         <w:rPr>
           <w:rtl w:val="0"/>
         </w:rPr>
-        <w:t xml:space="preserve">- Al activar una celda, se puede indicar además la cantidad de </w:t>
-      </w:r>
-      <w:r>
-        <w:rPr>
-          <w:b w:val="1"/>
-          <w:bCs w:val="1"/>
-          <w:rtl w:val="0"/>
-        </w:rPr>
-        <w:t xml:space="preserve">pasadas </w:t>
-      </w:r>
-      <w:r>
-        <w:rPr>
-          <w:rtl w:val="0"/>
-        </w:rPr>
-        <w:t xml:space="preserve">(repeticiones) que corresponden a esa posición del dibujo.</w:t>
+        <w:t xml:space="preserve">- El número a la derecha de cada fila (en la columna encabezada con ×) es la cantidad de </w:t>
+      </w:r>
+      <w:r>
+        <w:rPr>
+          <w:b w:val="1"/>
+          <w:bCs w:val="1"/>
+          <w:rtl w:val="0"/>
+        </w:rPr>
+        <w:t xml:space="preserve">pasadas</w:t>
+      </w:r>
+      <w:r>
+        <w:rPr>
+          <w:rtl w:val="0"/>
+        </w:rPr>
+        <w:t xml:space="preserve"> seguidas que se teje esa fila (repeticiones). Empieza en 1 y acepta de 1 a 9999 (ver el punto 7).</w:t>
       </w:r>
     </w:p>
     <w:p>
@@ -2993,18 +2993,18 @@
         <w:rPr>
           <w:rtl w:val="0"/>
         </w:rPr>
-        <w:t xml:space="preserve">- Si el dibujo que está cargado en el editor es distinto al que estaba asignado previamente al telar, el sistema asigna este nuevo dibujo, reinicia la posición de tejido al principio (fila 1, columna 1) y actualiza el estado real del telar a "Tejiendo" en la base de datos. Este cambio de estado es detectado por el equipo de control (ESP32), que a su vez acciona el relé conectado en paralelo al botón físico de Marcha del telar, arrancando la máquina real.</w:t>
-      </w:r>
-    </w:p>
-    <w:p>
-      <w:pPr>
-        <w:rPr/>
-      </w:pPr>
-      <w:r>
-        <w:rPr>
-          <w:rtl w:val="0"/>
-        </w:rPr>
-        <w:t xml:space="preserve">- Si el dibujo que está cargado en el editor es el mismo que ya estaba asignado al telar, el sistema no reinicia la posición ni envía una nueva orden de arranque: simplemente retoma la animación en pantalla desde la posición en la que se encontraba.</w:t>
+        <w:t xml:space="preserve">- Si el dibujo cargado en el editor es distinto del que tiene asignado el telar, el sistema asigna este nuevo dibujo, arranca la posición de tejido al principio (fila 1) y actualiza el estado real del telar a "Tejiendo" en la base de datos. Este cambio de estado es detectado por el equipo de control (ESP32), que a su vez acciona el relé conectado en paralelo al botón físico de Marcha del telar, arrancando la máquina real. Si el telar tenía un trabajo abierto de otro dibujo, la aplicación pregunta antes de empezar, porque ese trabajo se cierra y ya no se puede retomar.</w:t>
+      </w:r>
+    </w:p>
+    <w:p>
+      <w:pPr>
+        <w:rPr/>
+      </w:pPr>
+      <w:r>
+        <w:rPr>
+          <w:rtl w:val="0"/>
+        </w:rPr>
+        <w:t xml:space="preserve">- Si es el mismo dibujo que el telar ya tiene asignado (por ejemplo, después de una pausa), el sistema no reinicia la posición: retoma el tejido en la fila y la pasada en que quedó, que toma de la base de datos (aunque la página se haya cerrado o recargado), y vuelve a poner el telar en "Tejiendo", con lo que el equipo de control acciona Marcha.</w:t>
       </w:r>
     </w:p>
     <w:p>
@@ -3068,65 +3068,84 @@
         <w:rPr>
           <w:rtl w:val="0"/>
         </w:rPr>
-        <w:t xml:space="preserve">- El botón "Detener" fue eliminado de la interfaz: su función la cumple ahora el botón Pausa, que es el único botón real de parada. La función es detener la máquina real. Así es como tiene que funcionar: al tocarlo, el sistema actualiza el estado real del telar en la base de datos, cerrando el registro de producción en curso y llevando el estado a "Detenido". Ese cambio es detectado por el equipo de control, que acciona el relé conectado en paralelo al botón físico de Pausa del telar, deteniendo la máquina real.</w:t>
-      </w:r>
-    </w:p>
-    <w:p>
-      <w:pPr>
-        <w:rPr/>
-      </w:pPr>
-      <w:r>
-        <w:rPr>
-          <w:rtl w:val="0"/>
-        </w:rPr>
-        <w:t xml:space="preserve">- Hoy, tal como está construido, todavía no hace esto: </w:t>
-      </w:r>
-      <w:r>
-        <w:rPr>
-          <w:b w:val="1"/>
-          <w:bCs w:val="1"/>
-          <w:rtl w:val="0"/>
-        </w:rPr>
-        <w:t xml:space="preserve">solo pausa la animación que se ve en la pantalla del navegador</w:t>
-      </w:r>
-      <w:r>
-        <w:rPr>
-          <w:rtl w:val="0"/>
-        </w:rPr>
-        <w:t xml:space="preserve">, sin enviar ninguna orden al backend ni al equipo de control, por lo que el telar físico sigue tejiendo con normalidad aunque en la pantalla la animación esté detenida. Esto queda marcado como tarea pendiente de desarrollo (ver punto 7). Mientras esta corrección no esté hecha, quien use el sistema tiene que saber que pausar en la pantalla no equivale a pausar la máquina.</w:t>
-      </w:r>
-    </w:p>
-    <w:p>
-      <w:pPr>
-        <w:rPr/>
-      </w:pPr>
-      <w:r>
-        <w:rPr>
-          <w:rtl w:val="0"/>
-        </w:rPr>
-        <w:t xml:space="preserve">- Esta implementación (que Pausa accione de verdad el relé del equipo de control) se hace recién cuando se esté trabajando con el hardware conectado al telar real, no antes. Hasta ese momento, no tiene sentido activarla porque no hay equipo físico que responda a esa orden.</w:t>
-      </w:r>
-    </w:p>
-    <w:p>
-      <w:pPr>
-        <w:rPr/>
-      </w:pPr>
-      <w:r>
-        <w:rPr>
-          <w:rtl w:val="0"/>
-        </w:rPr>
-        <w:t xml:space="preserve">- Una consecuencia importante, una vez que Pausa haga la parada real: si después de pausar se quiere retomar el tejido, hay que volver a tocar Iniciar. Como el dibujo queda desasignado al pausar, el sistema lo va a tratar como una asignación nueva: la posición vuelve a empezar desde el principio del dibujo (fila 1, columna 1), no continúa desde el punto exacto en el que se dejó. Esto es así porque, en la etapa actual del proyecto, el sistema controla el arranque y la parada de la máquina, pero todavía no la posición exacta de tejido dentro del mecanismo físico.</w:t>
-      </w:r>
-    </w:p>
-    <w:p>
-      <w:pPr>
-        <w:rPr/>
-      </w:pPr>
-      <w:r>
-        <w:rPr>
-          <w:rtl w:val="0"/>
-        </w:rPr>
-        <w:t xml:space="preserve">- Sobre continuar el tejido exactamente desde la fila donde se dejó: no hace falta que el sistema lo resuelva por software. Eso se maneja directamente en la máquina física con el botón Retroceder de la botonera: es el que permite volver a la posición correcta antes de retomar, por ejemplo después de un hilo cortado, para que el patrón no quede mal. Por eso no importa que la posición vuelva a fila 1 al reasignar el patrón con Iniciar: la posición real de tejido la termina de ajustar el operario con Retroceder en la máquina, no la web.</w:t>
+        <w:t xml:space="preserve">- Detiene la máquina real: al tocarlo, el sistema pasa el telar a "Pausado" en la base de datos. Ese cambio es detectado por el equipo de control, que acciona el relé conectado en paralelo al botón físico de Pausa del telar. Funciona aunque el tejido se haya arrancado desde la botonera o desde otra pantalla. (El botón "Detener" se eliminó: Pausa es el único botón de parada, igual que en la máquina.)</w:t>
+      </w:r>
+    </w:p>
+    <w:p>
+      <w:pPr>
+        <w:rPr/>
+      </w:pPr>
+      <w:r>
+        <w:rPr>
+          <w:rtl w:val="0"/>
+        </w:rPr>
+        <w:t xml:space="preserve">- La pausa </w:t>
+      </w:r>
+      <w:r>
+        <w:rPr>
+          <w:b w:val="1"/>
+          <w:bCs w:val="1"/>
+          <w:rtl w:val="0"/>
+        </w:rPr>
+        <w:t xml:space="preserve">no cierra el trabajo</w:t>
+      </w:r>
+      <w:r>
+        <w:rPr>
+          <w:rtl w:val="0"/>
+        </w:rPr>
+        <w:t xml:space="preserve">: el dibujo sigue asignado y la posición se conserva. Para retomar se toca Iniciar (▶) y el tejido sigue exactamente desde donde quedó, no desde el principio. Si se cortó un hilo, la posición se corrige con Retroceder telar antes de retomar.</w:t>
+      </w:r>
+    </w:p>
+    <w:p>
+      <w:pPr>
+        <w:rPr/>
+      </w:pPr>
+      <w:r>
+        <w:rPr>
+          <w:rtl w:val="0"/>
+        </w:rPr>
+        <w:t xml:space="preserve">- Ninguna otra acción del editor (crear un dibujo nuevo, cambiar el tamaño, limpiar la grilla) le da la orden de Pausa al telar: solo este botón.</w:t>
+      </w:r>
+    </w:p>
+    <w:p>
+      <w:pPr>
+        <w:rPr/>
+      </w:pPr>
+      <w:r>
+        <w:rPr>
+          <w:b w:val="1"/>
+          <w:bCs w:val="1"/>
+          <w:rtl w:val="0"/>
+        </w:rPr>
+        <w:t xml:space="preserve">Terminar trabajo (</w:t>
+      </w:r>
+      <w:r>
+        <w:rPr>
+          <w:rFonts w:ascii="IBM Plex Sans" w:cs="IBM Plex Sans" w:eastAsia="IBM Plex Sans" w:hAnsi="IBM Plex Sans"/>
+          <w:b w:val="1"/>
+          <w:bCs w:val="1"/>
+          <w:rtl w:val="0"/>
+        </w:rPr>
+        <w:t xml:space="preserve">⏹</w:t>
+      </w:r>
+      <w:r>
+        <w:rPr>
+          <w:b w:val="1"/>
+          <w:bCs w:val="1"/>
+          <w:rtl w:val="0"/>
+        </w:rPr>
+        <w:t xml:space="preserve">):</w:t>
+      </w:r>
+    </w:p>
+    <w:p>
+      <w:pPr>
+        <w:rPr/>
+      </w:pPr>
+      <w:r>
+        <w:rPr>
+          <w:rtl w:val="0"/>
+        </w:rPr>
+        <w:t xml:space="preserve">- Cierra la producción del dibujo que se está tejiendo, después de pedir confirmación; si el telar estaba tejiendo, también lo detiene. La próxima vez que se toque Iniciar, el dibujo empieza desde la fila 1 y lo anterior ya no se puede retomar. Es la única forma de modificar la matriz de un dibujo que tiene un trabajo abierto, aunque esté en pausa.</w:t>
       </w:r>
     </w:p>
     <w:p>
@@ -3182,7 +3201,7 @@
         <w:rPr>
           <w:rtl w:val="0"/>
         </w:rPr>
-        <w:t xml:space="preserve">- Acciona el botón físico de Retroceder de la botonera del telar, a través de un relé del ESP32: mueve el mecanismo real de la máquina, no solo la posición registrada en el sistema. Por eso pide confirmación antes de ejecutarse. Se usa para corregir la posición tras un corte de hilo. (El botón anterior "Retroceder fila (↩)", que solo movía el contador en pantalla sin tocar la máquina, se eliminó: no tenía uso real y se prestaba a confusión con este.)</w:t>
+        <w:t xml:space="preserve">- Retrocede una pasada en la máquina real. Primero pausa el telar, después mueve la posición registrada una pasada hacia atrás y, por último, el equipo de control acciona el relé conectado en paralelo al botón físico de Retroceder de la botonera: mueve el mecanismo real de la máquina, no solo la posición en pantalla. Por eso pide confirmación antes de ejecutarse, y el tejido queda en pausa. Se usa para corregir la posición tras un corte de hilo. Con el sensor de pasada instalado, la pasada la descuenta el sensor al detectar el retroceso. (El botón anterior "Retroceder fila (↩)", que solo movía el contador en pantalla sin tocar la máquina, se eliminó: no tenía uso real y se prestaba a confusión con este.)</w:t>
       </w:r>
     </w:p>
     <w:p>
@@ -3238,19 +3257,9 @@
       </w:pPr>
       <w:r>
         <w:rPr>
-          <w:i w:val="1"/>
-          <w:iCs w:val="1"/>
-          <w:color w:val="606060"/>
-          <w:sz w:val="18"/>
-          <w:szCs w:val="18"/>
-          <w:rtl w:val="0"/>
-        </w:rPr>
-        <w:t xml:space="preserve">Barra de controles: Pausa (⏸), Iniciar (▶) y Retroceder telar (⏪).</w:t>
-      </w:r>
-      <w:r>
-        <w:rPr>
-          <w:rtl w:val="0"/>
-        </w:rPr>
+          <w:rtl w:val="0"/>
+        </w:rPr>
+        <w:t xml:space="preserve">Barra de controles: Pausa (⏸), Iniciar (▶), Retroceder telar (⏪) y Terminar trabajo (⏹).</w:t>
       </w:r>
     </w:p>
     <w:p>
@@ -3292,18 +3301,18 @@
         <w:rPr>
           <w:rtl w:val="0"/>
         </w:rPr>
-        <w:t xml:space="preserve">- Aparece en la barra de estado del editor cuando el ESP32 detecta que alguien usó a mano los botones Avanzar o Impulso del telar. Esos dos botones no se controlan desde la web (siguen siendo manuales), pero sí se sensan: como el sensor de pasada no distingue en qué sentido se movió la máquina, un uso manual puede desincronizar la posición registrada. El aviso queda visible hasta que alguien mira el telar, verifica dónde está parado realmente y toca "Confirmar".</w:t>
-      </w:r>
-    </w:p>
-    <w:p>
-      <w:pPr>
-        <w:rPr/>
-      </w:pPr>
-      <w:r>
-        <w:rPr>
-          <w:rtl w:val="0"/>
-        </w:rPr>
-        <w:t xml:space="preserve">Mientras el telar está en ejecución (Tejiendo), la matriz queda bloqueada para edición: no pueden modificarse el tamaño, los colores ni las pasadas hasta detener el tejido.</w:t>
+        <w:t xml:space="preserve">- Aparece en la barra de estado del editor cuando la posición registrada puede no coincidir con la de la máquina: si el equipo de control (ESP32) se reinició en pleno tejido (corte de luz o traslado), o si alguien usó a mano los botones Marcha o Retroceder de la botonera sin que hubiera un trabajo abierto en el sistema. El aviso dice cuál fue la causa y queda visible hasta que alguien mira el telar, verifica dónde está parado realmente y toca "Confirmar".</w:t>
+      </w:r>
+    </w:p>
+    <w:p>
+      <w:pPr>
+        <w:rPr/>
+      </w:pPr>
+      <w:r>
+        <w:rPr>
+          <w:rtl w:val="0"/>
+        </w:rPr>
+        <w:t xml:space="preserve">Mientras el telar está en ejecución (Tejiendo), la matriz queda bloqueada para edición: no pueden modificarse el tamaño, los colores ni las pasadas. Tampoco mientras el dibujo tenga un trabajo abierto, aunque esté en pausa, porque la posición guardada se refiere a esa matriz: para cambiarlo hay que terminar el trabajo con ⏹.</w:t>
       </w:r>
     </w:p>
     <w:p>
@@ -3973,12 +3982,9 @@
       </w:pPr>
       <w:r>
         <w:rPr>
-          <w:b w:val="0"/>
-          <w:i w:val="0"/>
-          <w:iCs w:val="1"/>
-          <w:rtl w:val="0"/>
-        </w:rPr>
-        <w:t>Porque hasta que se instale y se valide el sensor de pasada, la aplicación no mide las pasadas: las estima por tiempo, al ritmo de la máquina (300 pasadas por minuto), mientras el tejido está en marcha en el dispositivo donde se tocó ▶. Si ese dispositivo bloquea la pantalla, cierra la aplicación o pierde la conexión, la estimación se detiene o se atrasa aunque el telar siga tejiendo, y el número queda por debajo de lo real. Por eso se muestra como aproximado. Con el sensor instalado, el conteo lo lleva la máquina y no depende de ninguna pantalla.</w:t>
+          <w:rtl w:val="0"/>
+        </w:rPr>
+        <w:t xml:space="preserve">Porque hasta que se instale y se valide el sensor de pasada, la aplicación no mide las pasadas: las estima por tiempo, al ritmo de la máquina (300 pasadas por minuto), mientras el tejido está en marcha en una pantalla abierta. Si hay varias pantallas mostrando el mismo tejido, la cuenta la lleva una sola, para no contar dos veces; si esa se cierra, otra la toma en un par de segundos. Si no queda ninguna abierta (se bloquea la pantalla, se cierra la aplicación o se pierde la conexión), la estimación se detiene o se atrasa aunque el telar siga tejiendo, y el número queda por debajo de lo real. Por eso se muestra como aproximado. Con el sensor instalado, el conteo lo lleva la máquina y no depende de ninguna pantalla.</w:t>
       </w:r>
     </w:p>
     <w:sectPr>

</xml_diff>

<commit_message>
Tercera revisión de cierre: guardado de dibujos atómico, accesibilidad y documentación
- actualizarPatron en transacción con FOR UPDATE; asignar-patron lee el dibujo con FOR SHARE.
- Etiquetas accesibles en los campos de ingreso, recuperación, nombre, búsqueda y simulador.
- Manuales y lista de componentes al día (tres relés, Bloque A instalado, pausa sin trabajo).

Co-Authored-By: Claude Opus 5.5 <noreply@anthropic.com>
Claude-Session: https://claude.ai/code/session_01QiY8ZZNAM9gwPKiqSkCaaj
</commit_message>
<xml_diff>
--- a/documentacion_proyecto/Manual_Pagina_Web_Telar.docx
+++ b/documentacion_proyecto/Manual_Pagina_Web_Telar.docx
@@ -640,7 +640,7 @@
         <w:rPr>
           <w:rtl w:val="0"/>
         </w:rPr>
-        <w:t xml:space="preserve">- Se envía el dibujo al telar y se controla su ejecución: iniciar, pausar, retroceder. Además, la web refleja lo que se hace desde la botonera del telar: si un operario aprieta Marcha, Pausa o Retroceder en la máquina, el ESP32 lo detecta y la pantalla se actualiza sola.</w:t>
+        <w:t xml:space="preserve">- Se envía el dibujo al telar y se controla su ejecución: iniciar, pausar, retroceder. Además, la web refleja lo que se hace desde la botonera del telar: si un operario aprieta Marcha, Pausa o Retroceder en la máquina, el ESP32 lo detecta y la pantalla se actualiza sola. Si la máquina se pone en marcha desde la botonera con el mismo dibujo abierto en el editor, la pantalla se suma al tejido y sigue la cuenta desde la fila en que está el telar.</w:t>
       </w:r>
     </w:p>
     <w:p>
@@ -686,7 +686,7 @@
         <w:rPr>
           <w:rtl w:val="0"/>
         </w:rPr>
-        <w:t xml:space="preserve"> del telar (mediante el ESP32, que aprieta a distancia los mismos botones físicos de Marcha y Pausa de la máquina). La web todavía </w:t>
+        <w:t xml:space="preserve"> del telar (mediante el ESP32, que aprieta a distancia los mismos botones físicos de Marcha, Pausa y Retroceder de la máquina). La web todavía </w:t>
       </w:r>
       <w:r>
         <w:rPr>
@@ -3068,7 +3068,7 @@
         <w:rPr>
           <w:rtl w:val="0"/>
         </w:rPr>
-        <w:t xml:space="preserve">- Detiene la máquina real: al tocarlo, el sistema pasa el telar a "Pausado" en la base de datos. Ese cambio es detectado por el equipo de control, que acciona el relé conectado en paralelo al botón físico de Pausa del telar. Funciona aunque el tejido se haya arrancado desde la botonera o desde otra pantalla. (El botón "Detener" se eliminó: Pausa es el único botón de parada, igual que en la máquina.)</w:t>
+        <w:t xml:space="preserve">- Detiene la máquina real: al tocarlo, el sistema pasa el telar a "Pausado" en la base de datos. Ese cambio es detectado por el equipo de control, que acciona el relé conectado en paralelo al botón físico de Pausa del telar. Funciona aunque el tejido se haya arrancado desde la botonera o desde otra pantalla. Si no hay ningún trabajo abierto (por ejemplo, la máquina se arrancó a mano con Marcha sin un dibujo en curso), el telar queda en "Detenido": no hay nada que retomar. (El botón "Detener" se eliminó: Pausa es el único botón de parada, igual que en la máquina.)</w:t>
       </w:r>
     </w:p>
     <w:p>

</xml_diff>

<commit_message>
Web y documentos: la barra dice las filas reales, llave del intercalado continua y capturas nuevas del editor y la biblioteca en los manuales
Co-Authored-By: Claude Opus 5.5 <noreply@anthropic.com>
Claude-Session: https://claude.ai/code/session_01QiY8ZZNAM9gwPKiqSkCaaj
</commit_message>
<xml_diff>
--- a/documentacion_proyecto/Manual_Pagina_Web_Telar.docx
+++ b/documentacion_proyecto/Manual_Pagina_Web_Telar.docx
@@ -2585,7 +2585,7 @@
         <w:rPr/>
         <w:drawing>
           <wp:inline distB="0" distT="0" distL="0" distR="0">
-            <wp:extent cx="4811694" cy="2417249"/>
+            <wp:extent cx="2367642" cy="2651760"/>
             <wp:effectExtent b="0" l="0" r="0" t="0"/>
             <wp:docPr id="1133882110" name="image1.png"/>
             <a:graphic>
@@ -2605,7 +2605,7 @@
                   <pic:spPr>
                     <a:xfrm>
                       <a:off x="0" y="0"/>
-                      <a:ext cx="4811694" cy="2417249"/>
+                      <a:ext cx="2367642" cy="2651760"/>
                     </a:xfrm>
                     <a:prstGeom prst="rect"/>
                     <a:ln/>
@@ -2720,7 +2720,7 @@
         <w:rPr/>
         <w:drawing>
           <wp:inline distB="0" distT="0" distL="0" distR="0">
-            <wp:extent cx="4261697" cy="530301"/>
+            <wp:extent cx="4261697" cy="426169"/>
             <wp:effectExtent b="0" l="0" r="0" t="0"/>
             <wp:docPr id="1133882114" name="image10.png"/>
             <a:graphic>
@@ -2740,7 +2740,7 @@
                   <pic:spPr>
                     <a:xfrm>
                       <a:off x="0" y="0"/>
-                      <a:ext cx="4261697" cy="530301"/>
+                      <a:ext cx="4261697" cy="426169"/>
                     </a:xfrm>
                     <a:prstGeom prst="rect"/>
                     <a:ln/>
@@ -3064,7 +3064,7 @@
           <w:szCs w:val="18"/>
           <w:rtl w:val="0"/>
         </w:rPr>
-        <w:t>Editor con un dibujo cargado. Cada fila lleva una sola bobina: la celda marcada es la que se activa, y el número de la derecha indica cuántas pasadas seguidas se teje esa fila.</w:t>
+        <w:t>Editor con un dibujo cargado. Cada fila lleva una sola bobina: la celda marcada es la que se activa, y el número de la derecha indica cuántas pasadas seguidas se teje esa fila. Las llaves de la columna ⇄ agrupan filas intercaladas (filas 1 a 4 durante 120 pasadas, filas 6 y 7 durante 140), y en esas filas el cuadrado de la bobina muestra su lugar en el orden.</w:t>
       </w:r>
       <w:r>
         <w:rPr>

</xml_diff>

<commit_message>
Revisión: el modelo 3D en la documentación y textos de los sitios
- Documentación de Proyecto 4.3.2: ya hay un modelo 3D interactivo del
  gabinete (decía que no se hacía modelado tridimensional).
- Manual de la página web: el indicador rojo se llama «Sin conexión», con
  los segundos al lado.
- Bitácora 05/09: son dos módulos de relé, con tres relés en total.
- Componentes completos 2.1: el relé va en el lugar del lector.
- PDF de los cuatro Word, exportados de nuevo.

Co-Authored-By: Claude Opus 5.5 <noreply@anthropic.com>
Claude-Session: https://claude.ai/code/session_01QiY8ZZNAM9gwPKiqSkCaaj
</commit_message>
<xml_diff>
--- a/documentacion_proyecto/Manual_Pagina_Web_Telar.docx
+++ b/documentacion_proyecto/Manual_Pagina_Web_Telar.docx
@@ -2432,13 +2432,13 @@
           <w:bCs w:val="1"/>
           <w:rtl w:val="0"/>
         </w:rPr>
-        <w:t xml:space="preserve">Sin conexión (hace X s)</w:t>
-      </w:r>
-      <w:r>
-        <w:rPr>
-          <w:rtl w:val="0"/>
-        </w:rPr>
-        <w:t xml:space="preserve"> (indicador rojo): el equipo de control dejó de enviar señales de confirmación. Puede deberse a que está apagado, desconectado de la red, o tiene algún problema de funcionamiento.</w:t>
+        <w:t xml:space="preserve">Sin conexión</w:t>
+      </w:r>
+      <w:r>
+        <w:rPr>
+          <w:rtl w:val="0"/>
+        </w:rPr>
+        <w:t xml:space="preserve"> (indicador rojo): el equipo de control dejó de enviar señales de confirmación; al lado se ve hace cuántos segundos llegó la última. Puede deberse a que está apagado o desconectado de la red, o a que tiene algún problema de funcionamiento.</w:t>
       </w:r>
     </w:p>
     <w:p>

</xml_diff>

<commit_message>
Editor: la barra muestra en qué pasada de la fila va el telar
«Fila 2 / 7 · pasada 45 de 120» para las filas con repeticiones, y en un
intercalado «pasada 57 de 120 del intercalado». El manual de la página web
(Word, PDF y sitio) lo explica, y hay una prueba nueva en frontend.test.mjs.

Co-Authored-By: Claude Opus 5.5 <noreply@anthropic.com>
Claude-Session: https://claude.ai/code/session_01QiY8ZZNAM9gwPKiqSkCaaj
</commit_message>
<xml_diff>
--- a/documentacion_proyecto/Manual_Pagina_Web_Telar.docx
+++ b/documentacion_proyecto/Manual_Pagina_Web_Telar.docx
@@ -3133,6 +3133,17 @@
         <w:rPr>
           <w:rtl w:val="0"/>
         </w:rPr>
+        <w:t xml:space="preserve">- Mientras teje, la barra de abajo del editor dice en qué fila va el telar y, si esa fila se teje más de una pasada seguida, en qué pasada de la fila va: por ejemplo «Fila 2 / 7 · pasada 45 de 120». Así se sabe por qué parte del dibujo va la tela.</w:t>
+      </w:r>
+    </w:p>
+    <w:p>
+      <w:pPr>
+        <w:rPr/>
+      </w:pPr>
+      <w:r>
+        <w:rPr>
+          <w:rtl w:val="0"/>
+        </w:rPr>
       </w:r>
     </w:p>
     <w:p>
@@ -4003,7 +4014,7 @@
         <w:rPr>
           <w:rtl w:val="0"/>
         </w:rPr>
-        <w:t xml:space="preserve">- La barra de abajo del editor dice en qué fila va el telar y por qué pasada del intercalado va, por ejemplo «Fila 3 / 7 · intercalado 57 de 120».</w:t>
+        <w:t xml:space="preserve">- La barra de abajo del editor dice en qué fila va el telar y por qué pasada del intercalado va, por ejemplo «Fila 3 / 7 · pasada 57 de 120 del intercalado».</w:t>
       </w:r>
     </w:p>
     <w:p>

</xml_diff>